<commit_message>
Add STEM category positioning and broader funding roadmap to grant materials
Named Sandchemy's specific market category (Virtual Lab / Simulation-Based
STEM Learning) with sourced global market data and comparables (PhET,
Labster/PraxiLabs, Minecraft Education) across the pitch deck, grant brief,
README, and EDUCATION.md. Also researched and documented funding options
beyond CIP Spark (Yayasan PETRONAS, CIP Sprint, MRANTI SRF, TalentCorp
LiKES, MDEC MDCG) as a staged NOW/FOLLOW-ON/LATER roadmap in both grant
documents, and corrected the project contact email throughout.

Co-Authored-By: Claude Sonnet 5 <noreply@anthropic.com>
</commit_message>
<xml_diff>
--- a/pitch/Sandchemy_CIP_Spark_Grant_Brief.docx
+++ b/pitch/Sandchemy_CIP_Spark_Grant_Brief.docx
@@ -78,7 +78,7 @@
           <w:sz w:val="20"/>
           <w:szCs w:val="20"/>
         </w:rPr>
-        <w:t xml:space="preserve">Contact: cookingwithcattitude@gmail.com</w:t>
+        <w:t xml:space="preserve">Contact: aliff@sheikhhussien.com</w:t>
       </w:r>
     </w:p>
     <w:p>
@@ -666,6 +666,67 @@
           <w:szCs w:val="21"/>
         </w:rPr>
         <w:t xml:space="preserve">Sandchemy is positioned to address this market with zero hardware requirement (any browser, any device) and zero recurring infrastructure cost, while retaining a second, non-EdTech distribution channel through the existing global audience for physics/chemistry sandbox games.</w:t>
+      </w:r>
+    </w:p>
+    <w:p>
+      <w:pPr>
+        <w:pStyle w:val="Heading2"/>
+        <w:spacing w:after="120" w:before="240"/>
+      </w:pPr>
+      <w:r>
+        <w:rPr>
+          <w:b/>
+          <w:bCs/>
+          <w:color w:val="14172A"/>
+          <w:sz w:val="24"/>
+          <w:szCs w:val="24"/>
+        </w:rPr>
+        <w:t xml:space="preserve">5.1 Category: Virtual Lab / Simulation-Based STEM Learning</w:t>
+      </w:r>
+    </w:p>
+    <w:p>
+      <w:pPr>
+        <w:spacing w:after="160" w:line="300"/>
+      </w:pPr>
+      <w:r>
+        <w:rPr>
+          <w:i w:val="false"/>
+          <w:iCs w:val="false"/>
+          <w:color w:val="222222"/>
+          <w:sz w:val="21"/>
+          <w:szCs w:val="21"/>
+        </w:rPr>
+        <w:t xml:space="preserve">Beyond the Malaysia-wide EdTech figures above, Sandchemy sits inside a more specific, named global sub-segment: virtual laboratories / simulation-based STEM learning, valued at approximately USD 1.5 billion in 2024 and projected to reach USD 4.2 billion by 2033 (Business Research Insights, STEM Education Market Report). This is a defined category, not a generic “education game” claim.</w:t>
+      </w:r>
+    </w:p>
+    <w:p>
+      <w:pPr>
+        <w:spacing w:after="160" w:line="300"/>
+      </w:pPr>
+      <w:r>
+        <w:rPr>
+          <w:i w:val="false"/>
+          <w:iCs w:val="false"/>
+          <w:color w:val="222222"/>
+          <w:sz w:val="21"/>
+          <w:szCs w:val="21"/>
+        </w:rPr>
+        <w:t xml:space="preserve">The three most-cited comparables in this category each miss a property Sandchemy combines: PhET (free, university-backed) ships fixed, single-concept simulations rather than an open sandbox; Labster and PraxiLabs are paid, institution-licensed virtual labs with no free consumer tier; and Minecraft Education is the closest sandbox by shape but its blocks are not scientifically modelled. Sandchemy is free, offline-capable, built on sourced real-world physics/chemistry data, and keeps a persistent Discovery Journal — no named comparable combines all four.</w:t>
+      </w:r>
+    </w:p>
+    <w:p>
+      <w:pPr>
+        <w:spacing w:after="160" w:line="300"/>
+      </w:pPr>
+      <w:r>
+        <w:rPr>
+          <w:i w:val="false"/>
+          <w:iCs w:val="false"/>
+          <w:color w:val="222222"/>
+          <w:sz w:val="21"/>
+          <w:szCs w:val="21"/>
+        </w:rPr>
+        <w:t xml:space="preserve">Note: CIP Spark itself has no dedicated STEM-specific funding track — it is a general technology pre-seed grant. This category positioning is market-differentiation context for reviewers, not a claimed eligibility criterion.</w:t>
       </w:r>
     </w:p>
     <w:p>
@@ -1419,6 +1480,177 @@
     </w:p>
     <w:p>
       <w:pPr>
+        <w:pStyle w:val="Heading2"/>
+        <w:spacing w:after="120" w:before="240"/>
+      </w:pPr>
+      <w:r>
+        <w:rPr>
+          <w:b/>
+          <w:bCs/>
+          <w:color w:val="14172A"/>
+          <w:sz w:val="24"/>
+          <w:szCs w:val="24"/>
+        </w:rPr>
+        <w:t xml:space="preserve">8.1 Broader Funding Roadmap (Beyond CIP Spark)</w:t>
+      </w:r>
+    </w:p>
+    <w:p>
+      <w:pPr>
+        <w:spacing w:after="160" w:line="300"/>
+      </w:pPr>
+      <w:r>
+        <w:rPr>
+          <w:i w:val="false"/>
+          <w:iCs w:val="false"/>
+          <w:color w:val="222222"/>
+          <w:sz w:val="21"/>
+          <w:szCs w:val="21"/>
+        </w:rPr>
+        <w:t xml:space="preserve">CIP Spark is the lead application, but it is being pursued alongside — not instead of — the following, chosen for fit at the project's current stage or as a deliberate near-term follow-on. Eligibility is self-assessed against each programme's public criteria as of July 2026 and should be re-confirmed directly with each funder before applying.</w:t>
+      </w:r>
+    </w:p>
+    <w:p>
+      <w:pPr>
+        <w:pStyle w:val="ListParagraph"/>
+        <w:numPr>
+          <w:ilvl w:val="0"/>
+          <w:numId w:val="1"/>
+        </w:numPr>
+        <w:spacing w:after="90"/>
+      </w:pPr>
+      <w:r>
+        <w:rPr>
+          <w:b/>
+          <w:bCs/>
+          <w:color w:val="222222"/>
+          <w:sz w:val="21"/>
+          <w:szCs w:val="21"/>
+        </w:rPr>
+        <w:t xml:space="preserve">Yayasan PETRONAS — STEM Education Grant, up to RM1,000,000 over 3 years (apply now, in parallel): </w:t>
+      </w:r>
+      <w:r>
+        <w:rPr>
+          <w:color w:val="222222"/>
+          <w:sz w:val="21"/>
+          <w:szCs w:val="21"/>
+        </w:rPr>
+        <w:t xml:space="preserve">a CSR-style grant with no paid-up capital or company-age requirement, so it does not wait on incorporation the way SME/tech grants do.</w:t>
+      </w:r>
+    </w:p>
+    <w:p>
+      <w:pPr>
+        <w:pStyle w:val="ListParagraph"/>
+        <w:numPr>
+          <w:ilvl w:val="0"/>
+          <w:numId w:val="1"/>
+        </w:numPr>
+        <w:spacing w:after="90"/>
+      </w:pPr>
+      <w:r>
+        <w:rPr>
+          <w:b/>
+          <w:bCs/>
+          <w:color w:val="222222"/>
+          <w:sz w:val="21"/>
+          <w:szCs w:val="21"/>
+        </w:rPr>
+        <w:t xml:space="preserve">Cradle CIP Sprint — up to RM600,000, conditional/convertible (follow-on): </w:t>
+      </w:r>
+      <w:r>
+        <w:rPr>
+          <w:color w:val="222222"/>
+          <w:sz w:val="21"/>
+          <w:szCs w:val="21"/>
+        </w:rPr>
+        <w:t xml:space="preserve">Cradle's own next stage after CIP Spark; the natural seed-stage step once the company is formally incorporated.</w:t>
+      </w:r>
+    </w:p>
+    <w:p>
+      <w:pPr>
+        <w:pStyle w:val="ListParagraph"/>
+        <w:numPr>
+          <w:ilvl w:val="0"/>
+          <w:numId w:val="1"/>
+        </w:numPr>
+        <w:spacing w:after="90"/>
+      </w:pPr>
+      <w:r>
+        <w:rPr>
+          <w:b/>
+          <w:bCs/>
+          <w:color w:val="222222"/>
+          <w:sz w:val="21"/>
+          <w:szCs w:val="21"/>
+        </w:rPr>
+        <w:t xml:space="preserve">MRANTI Strategic Research Fund (SRF) — R&amp;D grant under Dana PEMACU MOSTI (follow-on): </w:t>
+      </w:r>
+      <w:r>
+        <w:rPr>
+          <w:color w:val="222222"/>
+          <w:sz w:val="21"/>
+          <w:szCs w:val="21"/>
+        </w:rPr>
+        <w:t xml:space="preserve">requires SSM company registration, RM10,000 minimum paid-up capital, and two directors — targeted for right after incorporation.</w:t>
+      </w:r>
+    </w:p>
+    <w:p>
+      <w:pPr>
+        <w:pStyle w:val="ListParagraph"/>
+        <w:numPr>
+          <w:ilvl w:val="0"/>
+          <w:numId w:val="1"/>
+        </w:numPr>
+        <w:spacing w:after="90"/>
+      </w:pPr>
+      <w:r>
+        <w:rPr>
+          <w:b/>
+          <w:bCs/>
+          <w:color w:val="222222"/>
+          <w:sz w:val="21"/>
+          <w:szCs w:val="21"/>
+        </w:rPr>
+        <w:t xml:space="preserve">TalentCorp LiKES (Internship Placement Matching Grant) — RM2,000 per intern (later): </w:t>
+      </w:r>
+      <w:r>
+        <w:rPr>
+          <w:color w:val="222222"/>
+          <w:sz w:val="21"/>
+          <w:szCs w:val="21"/>
+        </w:rPr>
+        <w:t xml:space="preserve">relevant once curriculum/content work scales to paid interns, not a pre-seed priority.</w:t>
+      </w:r>
+    </w:p>
+    <w:p>
+      <w:pPr>
+        <w:pStyle w:val="ListParagraph"/>
+        <w:numPr>
+          <w:ilvl w:val="0"/>
+          <w:numId w:val="1"/>
+        </w:numPr>
+        <w:spacing w:after="90"/>
+      </w:pPr>
+      <w:r>
+        <w:rPr>
+          <w:b/>
+          <w:bCs/>
+          <w:color w:val="222222"/>
+          <w:sz w:val="21"/>
+          <w:szCs w:val="21"/>
+        </w:rPr>
+        <w:t xml:space="preserve">MDEC Malaysia Digital Catalyst Grant (MDCG) — up to RM1,000,000, co-funded (later, growth-stage): </w:t>
+      </w:r>
+      <w:r>
+        <w:rPr>
+          <w:color w:val="222222"/>
+          <w:sz w:val="21"/>
+          <w:szCs w:val="21"/>
+        </w:rPr>
+        <w:t xml:space="preserve">requires RM500,000 minimum paid-up capital and at least one year of operating history — explicitly out of reach at pre-seed, tracked as a future target only.</w:t>
+      </w:r>
+    </w:p>
+    <w:p>
+      <w:pPr>
         <w:pStyle w:val="Heading1"/>
         <w:spacing w:after="160" w:before="320"/>
       </w:pPr>
@@ -2076,7 +2308,7 @@
           <w:sz w:val="21"/>
           <w:szCs w:val="21"/>
         </w:rPr>
-        <w:t xml:space="preserve">Email: cookingwithcattitude@gmail.com</w:t>
+        <w:t xml:space="preserve">Email: aliff@sheikhhussien.com</w:t>
       </w:r>
     </w:p>
     <w:p>

</xml_diff>